<commit_message>
Add the Ashoka emblem to the reminder letterheads.
</commit_message>
<xml_diff>
--- a/reminders_14oct/10_Reminder1_Letter_Memo1835.docx
+++ b/reminders_14oct/10_Reminder1_Letter_Memo1835.docx
@@ -2,6 +2,46 @@
 <file path=word/document.xml><?xml version="1.0" encoding="utf-8"?>
 <w:document xmlns:wpc="http://schemas.microsoft.com/office/word/2010/wordprocessingCanvas" xmlns:mo="http://schemas.microsoft.com/office/mac/office/2008/main" xmlns:mc="http://schemas.openxmlformats.org/markup-compatibility/2006" xmlns:mv="urn:schemas-microsoft-com:mac:vml" xmlns:o="urn:schemas-microsoft-com:office:office" xmlns:r="http://schemas.openxmlformats.org/officeDocument/2006/relationships" xmlns:m="http://schemas.openxmlformats.org/officeDocument/2006/math" xmlns:v="urn:schemas-microsoft-com:vml" xmlns:wp14="http://schemas.microsoft.com/office/word/2010/wordprocessingDrawing" xmlns:wp="http://schemas.openxmlformats.org/drawingml/2006/wordprocessingDrawing" xmlns:w10="urn:schemas-microsoft-com:office:word" xmlns:w="http://schemas.openxmlformats.org/wordprocessingml/2006/main" xmlns:w14="http://schemas.microsoft.com/office/word/2010/wordml" xmlns:wpg="http://schemas.microsoft.com/office/word/2010/wordprocessingGroup" xmlns:wpi="http://schemas.microsoft.com/office/word/2010/wordprocessingInk" xmlns:wne="http://schemas.microsoft.com/office/word/2006/wordml" xmlns:wps="http://schemas.microsoft.com/office/word/2010/wordprocessingShape" mc:Ignorable="w14 wp14">
   <w:body>
+    <w:p>
+      <w:pPr>
+        <w:spacing w:before="0" w:after="0" w:line="240" w:lineRule="auto"/>
+        <w:jc w:val="center"/>
+      </w:pPr>
+      <w:r>
+        <w:drawing>
+          <wp:inline xmlns:a="http://schemas.openxmlformats.org/drawingml/2006/main" xmlns:pic="http://schemas.openxmlformats.org/drawingml/2006/picture">
+            <wp:extent cx="350306" cy="558000"/>
+            <wp:docPr id="1" name="Picture 1"/>
+            <wp:cNvGraphicFramePr>
+              <a:graphicFrameLocks noChangeAspect="1"/>
+            </wp:cNvGraphicFramePr>
+            <a:graphic>
+              <a:graphicData uri="http://schemas.openxmlformats.org/drawingml/2006/picture">
+                <pic:pic>
+                  <pic:nvPicPr>
+                    <pic:cNvPr id="0" name="ashoka_emblem.png"/>
+                    <pic:cNvPicPr/>
+                  </pic:nvPicPr>
+                  <pic:blipFill>
+                    <a:blip r:embed="rId9"/>
+                    <a:stretch>
+                      <a:fillRect/>
+                    </a:stretch>
+                  </pic:blipFill>
+                  <pic:spPr>
+                    <a:xfrm>
+                      <a:off x="0" y="0"/>
+                      <a:ext cx="350306" cy="558000"/>
+                    </a:xfrm>
+                    <a:prstGeom prst="rect"/>
+                  </pic:spPr>
+                </pic:pic>
+              </a:graphicData>
+            </a:graphic>
+          </wp:inline>
+        </w:drawing>
+      </w:r>
+    </w:p>
     <w:p>
       <w:pPr>
         <w:spacing w:before="0" w:after="0" w:lineRule="exact" w:line="320"/>

</xml_diff>

<commit_message>
Update 14 Oct reminders with officer name, reminder mark, and cases already received.
Drop Debaprosad Talapatra, Jharna Chakraborty and Narayan Chatterjee from Memo 1634; Maya Kundu from 1729; Sudipta Sur from 1785; and Shib Prosad Shil from 1664. Record those receipts on the note sheets and letters.
</commit_message>
<xml_diff>
--- a/reminders_14oct/10_Reminder1_Letter_Memo1835.docx
+++ b/reminders_14oct/10_Reminder1_Letter_Memo1835.docx
@@ -7,6 +7,74 @@
         <w:spacing w:before="0" w:after="0" w:line="240" w:lineRule="auto"/>
         <w:jc w:val="center"/>
       </w:pPr>
+      <w:r>
+        <w:drawing>
+          <wp:anchor xmlns:a="http://schemas.openxmlformats.org/drawingml/2006/main" distT="0" distB="0" distL="114300" distR="114300" simplePos="0" relativeHeight="251658240" behindDoc="0" locked="0" layoutInCell="1" allowOverlap="1">
+            <wp:simplePos x="0" y="0"/>
+            <wp:positionH relativeFrom="page">
+              <wp:posOffset>5050000</wp:posOffset>
+            </wp:positionH>
+            <wp:positionV relativeFrom="page">
+              <wp:posOffset>220000</wp:posOffset>
+            </wp:positionV>
+            <wp:extent cx="2150000" cy="400000"/>
+            <wp:effectExtent l="25400" t="25400" r="63500" b="63500"/>
+            <wp:wrapNone/>
+            <wp:docPr id="50" name="ReminderMark"/>
+            <wp:cNvGraphicFramePr>
+              <a:graphicFrameLocks noChangeAspect="0"/>
+            </wp:cNvGraphicFramePr>
+            <a:graphic>
+              <a:graphicData uri="http://schemas.microsoft.com/office/word/2010/wordprocessingShape">
+                <wps:wsp>
+                  <wps:cNvSpPr txBox="1"/>
+                  <wps:spPr>
+                    <a:xfrm>
+                      <a:off x="0" y="0"/>
+                      <a:ext cx="2150000" cy="400000"/>
+                    </a:xfrm>
+                    <a:prstGeom prst="rect">
+                      <a:avLst/>
+                    </a:prstGeom>
+                    <a:noFill/>
+                    <a:ln>
+                      <a:noFill/>
+                    </a:ln>
+                  </wps:spPr>
+                  <wps:txbx>
+                    <w:txbxContent>
+                      <w:p>
+                        <w:pPr>
+                          <w:jc w:val="right"/>
+                          <w:spacing w:before="0" w:after="0"/>
+                        </w:pPr>
+                        <w:r>
+                          <w:rPr>
+                            <w:rFonts w:ascii="Bookman Old Style" w:hAnsi="Bookman Old Style" w:cs="Bookman Old Style" w:eastAsia="Bookman Old Style"/>
+                            <w:b/>
+                            <w:i/>
+                            <w:sz w:val="44"/>
+                            <w:szCs w:val="44"/>
+                            <w:color w:val="7A1020"/>
+                            <w14:textOutline w14:w="12700" w14:cap="rnd" w14:cmpd="sng" w14:algn="ctr">
+                              <w14:solidFill>
+                                <w14:srgbClr w14:val="7A1020"/>
+                              </w14:solidFill>
+                              <w14:prstDash w14:val="solid"/>
+                            </w14:textOutline>
+                          </w:rPr>
+                          <w:t>Reminder-1</w:t>
+                        </w:r>
+                      </w:p>
+                    </w:txbxContent>
+                  </wps:txbx>
+                  <wps:bodyPr wrap="none" lIns="0" tIns="0" rIns="0" bIns="0" rtlCol="0" anchor="ctr"/>
+                </wps:wsp>
+              </a:graphicData>
+            </a:graphic>
+          </wp:anchor>
+        </w:drawing>
+      </w:r>
       <w:r>
         <w:drawing>
           <wp:inline xmlns:a="http://schemas.openxmlformats.org/drawingml/2006/main" xmlns:pic="http://schemas.openxmlformats.org/drawingml/2006/picture">
@@ -339,7 +407,22 @@
           <w:color w:val="000000"/>
           <w:sz w:val="24"/>
         </w:rPr>
-        <w:t>Sub-Divisional Officer,</w:t>
+        <w:t>Dr Dipanwita Patra, WBCS (Exe)</w:t>
+      </w:r>
+    </w:p>
+    <w:p>
+      <w:pPr>
+        <w:spacing w:before="0" w:after="0" w:lineRule="exact" w:line="320"/>
+        <w:jc w:val="right"/>
+      </w:pPr>
+      <w:r>
+        <w:rPr>
+          <w:rFonts w:ascii="Bookman Old Style" w:hAnsi="Bookman Old Style" w:cs="Bookman Old Style" w:eastAsia="Bookman Old Style"/>
+          <w:b/>
+          <w:color w:val="000000"/>
+          <w:sz w:val="24"/>
+        </w:rPr>
+        <w:t>Sub-Divisional Officer</w:t>
       </w:r>
     </w:p>
     <w:p>
@@ -354,7 +437,7 @@
           <w:color w:val="000000"/>
           <w:sz w:val="24"/>
         </w:rPr>
-        <w:t>Balurghat, Dakshin Dinajpur.</w:t>
+        <w:t>Balurghat, Dakshin Dinajpur</w:t>
       </w:r>
     </w:p>
     <w:p>
@@ -453,7 +536,7 @@
           <w:color w:val="000000"/>
           <w:sz w:val="24"/>
         </w:rPr>
-        <w:t>Sub-Divisional Officer,</w:t>
+        <w:t>Dr Dipanwita Patra, WBCS (Exe)</w:t>
       </w:r>
     </w:p>
     <w:p>
@@ -468,7 +551,22 @@
           <w:color w:val="000000"/>
           <w:sz w:val="24"/>
         </w:rPr>
-        <w:t>Balurghat, Dakshin Dinajpur.</w:t>
+        <w:t>Sub-Divisional Officer</w:t>
+      </w:r>
+    </w:p>
+    <w:p>
+      <w:pPr>
+        <w:spacing w:before="0" w:after="0" w:lineRule="exact" w:line="320"/>
+        <w:jc w:val="right"/>
+      </w:pPr>
+      <w:r>
+        <w:rPr>
+          <w:rFonts w:ascii="Bookman Old Style" w:hAnsi="Bookman Old Style" w:cs="Bookman Old Style" w:eastAsia="Bookman Old Style"/>
+          <w:b/>
+          <w:color w:val="000000"/>
+          <w:sz w:val="24"/>
+        </w:rPr>
+        <w:t>Balurghat, Dakshin Dinajpur</w:t>
       </w:r>
     </w:p>
     <w:p>
@@ -1909,7 +2007,7 @@
           <w:color w:val="000000"/>
           <w:sz w:val="24"/>
         </w:rPr>
-        <w:t>Sub-Divisional Officer,</w:t>
+        <w:t>Dr Dipanwita Patra, WBCS (Exe)</w:t>
       </w:r>
     </w:p>
     <w:p>
@@ -1924,7 +2022,22 @@
           <w:color w:val="000000"/>
           <w:sz w:val="24"/>
         </w:rPr>
-        <w:t>Balurghat, Dakshin Dinajpur.</w:t>
+        <w:t>Sub-Divisional Officer</w:t>
+      </w:r>
+    </w:p>
+    <w:p>
+      <w:pPr>
+        <w:spacing w:before="0" w:after="0" w:lineRule="exact" w:line="320"/>
+        <w:jc w:val="right"/>
+      </w:pPr>
+      <w:r>
+        <w:rPr>
+          <w:rFonts w:ascii="Bookman Old Style" w:hAnsi="Bookman Old Style" w:cs="Bookman Old Style" w:eastAsia="Bookman Old Style"/>
+          <w:b/>
+          <w:color w:val="000000"/>
+          <w:sz w:val="24"/>
+        </w:rPr>
+        <w:t>Balurghat, Dakshin Dinajpur</w:t>
       </w:r>
     </w:p>
     <w:sectPr>

</xml_diff>